<commit_message>
docs: update harga jasa (6jt), wablas, server di KKS PPDB 2026
</commit_message>
<xml_diff>
--- a/Draft_KKS_PPDB_2026.docx
+++ b/Draft_KKS_PPDB_2026.docx
@@ -1022,7 +1022,7 @@
                 <w:bCs/>
                 <w:color w:val="374151"/>
               </w:rPr>
-              <w:t>Rp 5.000.000</w:t>
+              <w:t>Rp 6.000.000</w:t>
             </w:r>
           </w:p>
         </w:tc>
@@ -1155,7 +1155,7 @@
                 <w:rFonts w:ascii="Arial" w:eastAsia="Arial" w:hAnsi="Arial" w:cs="Arial"/>
                 <w:color w:val="374151"/>
               </w:rPr>
-              <w:t>Rp 1.000.000 / tahun</w:t>
+              <w:t>Rp 1.000.000 / tahun (estimasi)</w:t>
             </w:r>
           </w:p>
         </w:tc>
@@ -1223,7 +1223,7 @@
                 <w:bCs/>
                 <w:color w:val="1A6B5A"/>
               </w:rPr>
-              <w:t>Rp 7.100.000</w:t>
+              <w:t>± Rp 7.400.000 – Rp 8.400.000</w:t>
             </w:r>
           </w:p>
         </w:tc>
@@ -1662,7 +1662,7 @@
                 <w:rFonts w:ascii="Arial" w:eastAsia="Arial" w:hAnsi="Arial" w:cs="Arial"/>
                 <w:color w:val="374151"/>
               </w:rPr>
-              <w:t>Rp 1.000.000 / tahun</w:t>
+              <w:t>Rp 1.000.000 / tahun (estimasi)</w:t>
             </w:r>
           </w:p>
         </w:tc>
@@ -2023,7 +2023,7 @@
                 <w:rFonts w:ascii="Arial" w:eastAsia="Arial" w:hAnsi="Arial" w:cs="Arial"/>
                 <w:color w:val="374151"/>
               </w:rPr>
-              <w:t>Rp 912.000 / tahun</w:t>
+              <w:t>Rp 240.000 – Rp 912.000 / tahun (Rp 20.000 – Rp 76.000/bulan, tergantung level paket yang dipilih klien)</w:t>
             </w:r>
           </w:p>
         </w:tc>
@@ -4890,7 +4890,7 @@
                 <w:bCs/>
                 <w:color w:val="374151"/>
               </w:rPr>
-              <w:t>Rp 2.500.000</w:t>
+              <w:t>Rp 3.000.000</w:t>
             </w:r>
           </w:p>
         </w:tc>
@@ -5013,7 +5013,7 @@
                 <w:rFonts w:ascii="Arial" w:eastAsia="Arial" w:hAnsi="Arial" w:cs="Arial"/>
                 <w:color w:val="374151"/>
               </w:rPr>
-              <w:t>Rp 1.500.000</w:t>
+              <w:t>Rp 1.800.000</w:t>
             </w:r>
           </w:p>
         </w:tc>
@@ -5136,7 +5136,7 @@
                 <w:rFonts w:ascii="Arial" w:eastAsia="Arial" w:hAnsi="Arial" w:cs="Arial"/>
                 <w:color w:val="374151"/>
               </w:rPr>
-              <w:t>Rp 1.000.000</w:t>
+              <w:t>Rp 1.200.000</w:t>
             </w:r>
           </w:p>
         </w:tc>

</xml_diff>

<commit_message>
docs: ubah profesi menjadi Konsultan & Pengembang IT agar lebih relevan dan elegan
</commit_message>
<xml_diff>
--- a/Draft_KKS_PPDB_2026.docx
+++ b/Draft_KKS_PPDB_2026.docx
@@ -88,7 +88,7 @@
     </w:p>
     <w:p>
       <w:r>
-        <w:t xml:space="preserve">   • Profesi: Ahli Pembuat Website (Fullstack Web Developer)</w:t>
+        <w:t xml:space="preserve">   • Profesi: Konsultan &amp; Pengembang IT</w:t>
       </w:r>
     </w:p>
     <w:p>
@@ -765,7 +765,7 @@
               <w:jc w:val="center"/>
             </w:pPr>
             <w:r>
-              <w:t xml:space="preserve">Fullstack Web Developer</w:t>
+              <w:t xml:space="preserve">Konsultan &amp; Pengembang IT</w:t>
             </w:r>
           </w:p>
           <w:p>

</xml_diff>